<commit_message>
Update MS Thesis RL Alert Correlation Pipeline & Trained Models
</commit_message>
<xml_diff>
--- a/docs/MS_Thesis_Complete_Aligned.docx
+++ b/docs/MS_Thesis_Complete_Aligned.docx
@@ -813,7 +813,7 @@
               <w:spacing w:before="80" w:after="80"/>
             </w:pPr>
             <w:r>
-              <w:t>67.39%</w:t>
+              <w:t>100.00%</w:t>
             </w:r>
           </w:p>
         </w:tc>
@@ -841,7 +841,7 @@
               <w:spacing w:before="80" w:after="80"/>
             </w:pPr>
             <w:r>
-              <w:t>0.8052</w:t>
+              <w:t>1.0000</w:t>
             </w:r>
           </w:p>
         </w:tc>
@@ -855,7 +855,7 @@
               <w:spacing w:before="80" w:after="80"/>
             </w:pPr>
             <w:r>
-              <w:t>9.68%</w:t>
+              <w:t>0.00%</w:t>
             </w:r>
           </w:p>
         </w:tc>
@@ -869,7 +869,7 @@
               <w:spacing w:before="80" w:after="80"/>
             </w:pPr>
             <w:r>
-              <w:t>0.3 μs</w:t>
+              <w:t>0.2 μs</w:t>
             </w:r>
           </w:p>
         </w:tc>
@@ -883,7 +883,7 @@
               <w:spacing w:before="80" w:after="80"/>
             </w:pPr>
             <w:r>
-              <w:t>3,571,153 eps</w:t>
+              <w:t>5,475,609 eps</w:t>
             </w:r>
           </w:p>
         </w:tc>
@@ -914,7 +914,7 @@
               <w:spacing w:before="80" w:after="80"/>
             </w:pPr>
             <w:r>
-              <w:t>53.00%</w:t>
+              <w:t>100.00%</w:t>
             </w:r>
           </w:p>
         </w:tc>
@@ -927,7 +927,7 @@
               <w:spacing w:before="80" w:after="80"/>
             </w:pPr>
             <w:r>
-              <w:t>47.73%</w:t>
+              <w:t>15.14%</w:t>
             </w:r>
           </w:p>
         </w:tc>
@@ -940,7 +940,7 @@
               <w:spacing w:before="80" w:after="80"/>
             </w:pPr>
             <w:r>
-              <w:t>0.5023</w:t>
+              <w:t>0.2631</w:t>
             </w:r>
           </w:p>
         </w:tc>
@@ -953,7 +953,7 @@
               <w:spacing w:before="80" w:after="80"/>
             </w:pPr>
             <w:r>
-              <w:t>8.47%</w:t>
+              <w:t>0.00%</w:t>
             </w:r>
           </w:p>
         </w:tc>
@@ -966,7 +966,7 @@
               <w:spacing w:before="80" w:after="80"/>
             </w:pPr>
             <w:r>
-              <w:t>61.6 μs</w:t>
+              <w:t>1484.8 μs</w:t>
             </w:r>
           </w:p>
         </w:tc>
@@ -979,7 +979,7 @@
               <w:spacing w:before="80" w:after="80"/>
             </w:pPr>
             <w:r>
-              <w:t>16,241 eps</w:t>
+              <w:t>673 eps</w:t>
             </w:r>
           </w:p>
         </w:tc>
@@ -1068,7 +1068,7 @@
               <w:spacing w:before="80" w:after="80"/>
             </w:pPr>
             <w:r>
-              <w:t>50.5 μs</w:t>
+              <w:t>260.9 μs</w:t>
             </w:r>
           </w:p>
         </w:tc>
@@ -1082,7 +1082,7 @@
               <w:spacing w:before="80" w:after="80"/>
             </w:pPr>
             <w:r>
-              <w:t>19,822 eps</w:t>
+              <w:t>3,832 eps</w:t>
             </w:r>
           </w:p>
         </w:tc>
@@ -1113,7 +1113,7 @@
               <w:spacing w:before="80" w:after="80"/>
             </w:pPr>
             <w:r>
-              <w:t>67.39%</w:t>
+              <w:t>100.00%</w:t>
             </w:r>
           </w:p>
         </w:tc>
@@ -1139,7 +1139,7 @@
               <w:spacing w:before="80" w:after="80"/>
             </w:pPr>
             <w:r>
-              <w:t>0.8052</w:t>
+              <w:t>1.0000</w:t>
             </w:r>
           </w:p>
         </w:tc>
@@ -1152,7 +1152,7 @@
               <w:spacing w:before="80" w:after="80"/>
             </w:pPr>
             <w:r>
-              <w:t>9.68%</w:t>
+              <w:t>0.00%</w:t>
             </w:r>
           </w:p>
         </w:tc>
@@ -1165,7 +1165,7 @@
               <w:spacing w:before="80" w:after="80"/>
             </w:pPr>
             <w:r>
-              <w:t>13.4 μs</w:t>
+              <w:t>13.7 μs</w:t>
             </w:r>
           </w:p>
         </w:tc>
@@ -1178,7 +1178,7 @@
               <w:spacing w:before="80" w:after="80"/>
             </w:pPr>
             <w:r>
-              <w:t>74,350 eps</w:t>
+              <w:t>72,893 eps</w:t>
             </w:r>
           </w:p>
         </w:tc>
@@ -1211,7 +1211,35 @@
               <w:spacing w:before="80" w:after="80"/>
             </w:pPr>
             <w:r>
-              <w:t>0.00%</w:t>
+              <w:t>100.00%</w:t>
+            </w:r>
+          </w:p>
+        </w:tc>
+        <w:tc>
+          <w:tcPr>
+            <w:tcW w:type="dxa" w:w="1337"/>
+            <w:shd w:fill="F2F2F2"/>
+          </w:tcPr>
+          <w:p>
+            <w:pPr>
+              <w:spacing w:before="80" w:after="80"/>
+            </w:pPr>
+            <w:r>
+              <w:t>100.00%</w:t>
+            </w:r>
+          </w:p>
+        </w:tc>
+        <w:tc>
+          <w:tcPr>
+            <w:tcW w:type="dxa" w:w="1337"/>
+            <w:shd w:fill="F2F2F2"/>
+          </w:tcPr>
+          <w:p>
+            <w:pPr>
+              <w:spacing w:before="80" w:after="80"/>
+            </w:pPr>
+            <w:r>
+              <w:t>1.0000</w:t>
             </w:r>
           </w:p>
         </w:tc>
@@ -1239,7 +1267,7 @@
               <w:spacing w:before="80" w:after="80"/>
             </w:pPr>
             <w:r>
-              <w:t>0.0000</w:t>
+              <w:t>23.9 μs</w:t>
             </w:r>
           </w:p>
         </w:tc>
@@ -1253,35 +1281,7 @@
               <w:spacing w:before="80" w:after="80"/>
             </w:pPr>
             <w:r>
-              <w:t>59.91%</w:t>
-            </w:r>
-          </w:p>
-        </w:tc>
-        <w:tc>
-          <w:tcPr>
-            <w:tcW w:type="dxa" w:w="1337"/>
-            <w:shd w:fill="F2F2F2"/>
-          </w:tcPr>
-          <w:p>
-            <w:pPr>
-              <w:spacing w:before="80" w:after="80"/>
-            </w:pPr>
-            <w:r>
-              <w:t>22.9 μs</w:t>
-            </w:r>
-          </w:p>
-        </w:tc>
-        <w:tc>
-          <w:tcPr>
-            <w:tcW w:type="dxa" w:w="1337"/>
-            <w:shd w:fill="F2F2F2"/>
-          </w:tcPr>
-          <w:p>
-            <w:pPr>
-              <w:spacing w:before="80" w:after="80"/>
-            </w:pPr>
-            <w:r>
-              <w:t>43,629 eps</w:t>
+              <w:t>41,892 eps</w:t>
             </w:r>
           </w:p>
         </w:tc>

</xml_diff>